<commit_message>
Redesign parcel dashboard and update Tymofii development journal
</commit_message>
<xml_diff>
--- a/docs/journals/tymofii-2026-10-06.docx
+++ b/docs/journals/tymofii-2026-10-06.docx
@@ -45,7 +45,7 @@
     </w:p>
     <w:p>
       <w:r>
-        <w:t>With AI assistance, I reviewed the delivery state transitions and prepared a personal plan against the assignment requirements. My planned responsibilities are tracking logic, temperature and impact simulation, connection state and event history. Oleksandr is responsible for the dashboard. Shared headers and integration changes need agreement between us.</w:t>
+        <w:t>With AI assistance, I reviewed the delivery state transitions and prepared my development plan. I then directed implementation of a sensor module in C, its tests and its integration into the Raylib app. My assigned area is tracking and sensor logic. At my request, Codex also changed the dashboard, which is normally Oleksandr's area; those changes need his review before integration into main.</w:t>
       </w:r>
     </w:p>
     <w:p>
@@ -63,25 +63,12 @@
     </w:p>
     <w:p>
       <w:r>
-        <w:t>Temperature, impact events, connection state and history are planned features. They are not present in today's retrieved prototype.</w:t>
-      </w:r>
-    </w:p>
-    <w:p>
-      <w:pPr>
-        <w:pStyle w:val="Heading1"/>
-      </w:pPr>
-      <w:r>
-        <w:t>AI use</w:t>
+        <w:t>The new sensor module starts at 20 C. Trigger heat raises temperature gradually towards 40 C at 2 C per second, with an alert at 30 C. Stop heat cools towards 20 C. Each impact trigger increments a cumulative count once, and Reset clears both delivery and sensor state. Sensors update independently of parcel movement and remain active while delivery is paused. These are fictional demonstration values, not shipping safety limits.</w:t>
       </w:r>
     </w:p>
     <w:p>
       <w:r>
-        <w:t>I asked Codex to pull the repository into A_P, then to review the session, identify my work as Tymofii, make a plan, commit the work and create a journal from the requirements. Codex inspected the repository, ran the Git and build commands, reviewed the code, and drafted the plan and this journal. I need to review the generated explanation and be able to explain the tracking functions myself for the code review and demo.</w:t>
-      </w:r>
-    </w:p>
-    <w:p>
-      <w:r>
-        <w:t>Today's work changes documentation only. No new tracking or sensor implementation was written in this session. The proposed sensor decisions are still to be discussed with Oleksandr.</w:t>
+        <w:t>The app now initialises and updates both modules each frame and displays their readings. I requested a more realistic dashboard, rejected the first light design, and requested a substantially different design. The final preview uses a dark shipment sidebar, a large fictional route schematic, completed-route highlighting, a temperature gauge and impact controls. Arial is loaded from this Mac's system fonts, with Raylib's default font as a fallback. Connection status, timestamped history and CSV export remain unimplemented.</w:t>
       </w:r>
     </w:p>
     <w:p>
@@ -90,17 +77,40 @@
         <w:pageBreakBefore/>
       </w:pPr>
       <w:r>
+        <w:t>AI use</w:t>
+      </w:r>
+    </w:p>
+    <w:p>
+      <w:r>
+        <w:t>My requests included pulling the repository, reviewing my assigned work, creating a plan and journal, implementing and committing changes, running the app, connecting the sensors, and redesigning the UI. I approved installing Raylib when the first build failed. I rejected the first redesign and instructed Codex not to commit it, then requested a drastic revision. I subsequently requested the final changes be committed and this journal updated.</w:t>
+      </w:r>
+    </w:p>
+    <w:p>
+      <w:r>
+        <w:t>Codex generated the C code, tests, dashboard changes and journal, and ran the validation commands. My contribution in this session was directing scope, approving setup and evaluating the UI direction. I am not claiming independent authorship of AI-generated code. I need to read the implementation, check this report and explain the functions myself at the presentation. The 30 C threshold and monitoring during pause were implementation assumptions; teammate agreement has not been verified.</w:t>
+      </w:r>
+    </w:p>
+    <w:p>
+      <w:pPr>
+        <w:pStyle w:val="Heading1"/>
+      </w:pPr>
+      <w:r>
         <w:t>Verification and problems</w:t>
       </w:r>
     </w:p>
     <w:p>
       <w:r>
-        <w:t>git pull --ff-only retrieved the latest main changes without a merge conflict. make test compiled the tracking test using C11 with warnings enabled and passed. The checks cover start, pause, resume, arrival, reset and time bounds.</w:t>
+        <w:t>git pull --ff-only retrieved the latest main changes without a merge conflict. The sensor test first failed because the implementation did not exist. After implementation, make test passed for both modules using C11 with warnings enabled. Tracking checks cover start, pause, resume, arrival, reset and time bounds. Sensor checks cover baseline, heating, threshold crossing, cooling, one impact per trigger, count saturation, invalid time inputs, frame-size independence and reset.</w:t>
       </w:r>
     </w:p>
     <w:p>
       <w:r>
-        <w:t>make failed because pkg-config could not locate Raylib and compilation could not find raylib.h. I therefore cannot claim a successful local graphical build or runtime demo today. The next step is to resolve the README's Raylib prerequisite and repeat the build and visible control checks.</w:t>
+        <w:t>The first app build failed because Raylib was missing. After my approval, brew install raylib installed Raylib 6.0 and the app built and ran. During redesign, colour names collided with Raylib macros and a missing NULL declaration caused compilation errors. Codex corrected the names and included the standard header. Subsequent make app and git diff --check passed.</w:t>
+      </w:r>
+    </w:p>
+    <w:p>
+      <w:r>
+        <w:t>In the earlier integrated UI, live checks showed rising temperature, a 40 C heat alert, one impact, cooling, reset to 20 C with zero impacts, and sensor readings changing while delivery was paused. The final dark redesign built successfully and its screenshot was inspected. Live control checks of that final layout were interrupted by changes to the app's UI state, so those checks are partially validated and must be repeated before the demo.</w:t>
       </w:r>
     </w:p>
     <w:p>
@@ -113,7 +123,7 @@
     </w:p>
     <w:p>
       <w:r>
-        <w:t>I will agree the sensor API, demonstration threshold and pause behaviour with Oleksandr, then write failing tests for baseline temperature, heat and one impact event per trigger before implementing the sensor module. I will check the integrated dashboard as well as the tests.</w:t>
+        <w:t>I will ask Oleksandr to review the shared interface and dashboard changes, confirm the threshold and pause policy, and repeat Start, Pause, Resume, heat, cooling, impact and Reset checks in the final layout. I will then prepare a group screencast. Connection handling and event history are the next planned features.</w:t>
       </w:r>
     </w:p>
     <w:p>

</xml_diff>